<commit_message>
Updated team contribution with my contributions.
</commit_message>
<xml_diff>
--- a/docs/phase4/team-contribution.docx
+++ b/docs/phase4/team-contribution.docx
@@ -23,15 +23,39 @@
       <w:r>
         <w:rPr>
           <w:rFonts w:ascii="Times New Roman" w:eastAsia="Times New Roman" w:hAnsi="Times New Roman" w:cs="Times New Roman"/>
+          <w:color w:val="0F1115"/>
+          <w:kern w:val="0"/>
+          <w14:ligatures w14:val="none"/>
+        </w:rPr>
+        <w:tab/>
+      </w:r>
+      <w:r>
+        <w:rPr>
+          <w:rFonts w:ascii="Times New Roman" w:eastAsia="Times New Roman" w:hAnsi="Times New Roman" w:cs="Times New Roman"/>
+          <w:color w:val="0F1115"/>
+          <w:kern w:val="0"/>
+          <w14:ligatures w14:val="none"/>
+        </w:rPr>
+        <w:tab/>
+      </w:r>
+      <w:r>
+        <w:rPr>
+          <w:rFonts w:ascii="Times New Roman" w:eastAsia="Times New Roman" w:hAnsi="Times New Roman" w:cs="Times New Roman"/>
           <w:b/>
           <w:bCs/>
           <w:color w:val="0F1115"/>
           <w:kern w:val="0"/>
           <w14:ligatures w14:val="none"/>
         </w:rPr>
-        <w:tab/>
-      </w:r>
-      <w:r>
+        <w:t>Dollar Doodle:</w:t>
+      </w:r>
+    </w:p>
+    <w:p>
+      <w:pPr>
+        <w:spacing w:after="240" w:line="480" w:lineRule="auto"/>
+        <w:ind w:left="3600"/>
+        <w:jc w:val="both"/>
+        <w:outlineLvl w:val="2"/>
         <w:rPr>
           <w:rFonts w:ascii="Times New Roman" w:eastAsia="Times New Roman" w:hAnsi="Times New Roman" w:cs="Times New Roman"/>
           <w:b/>
@@ -40,15 +64,8 @@
           <w:kern w:val="0"/>
           <w14:ligatures w14:val="none"/>
         </w:rPr>
-        <w:tab/>
-        <w:t>Dollar Doodle:</w:t>
-      </w:r>
-    </w:p>
-    <w:p>
-      <w:pPr>
-        <w:spacing w:after="240" w:line="480" w:lineRule="auto"/>
-        <w:jc w:val="both"/>
-        <w:outlineLvl w:val="2"/>
+      </w:pPr>
+      <w:r>
         <w:rPr>
           <w:rFonts w:ascii="Times New Roman" w:eastAsia="Times New Roman" w:hAnsi="Times New Roman" w:cs="Times New Roman"/>
           <w:b/>
@@ -57,7 +74,8 @@
           <w:kern w:val="0"/>
           <w14:ligatures w14:val="none"/>
         </w:rPr>
-      </w:pPr>
+        <w:t xml:space="preserve">        </w:t>
+      </w:r>
       <w:r>
         <w:rPr>
           <w:rFonts w:ascii="Times New Roman" w:eastAsia="Times New Roman" w:hAnsi="Times New Roman" w:cs="Times New Roman"/>
@@ -136,16 +154,16 @@
           <w:kern w:val="0"/>
           <w14:ligatures w14:val="none"/>
         </w:rPr>
-        <w:t>Alex Hildreth</w:t>
-      </w:r>
-      <w:r>
-        <w:rPr>
-          <w:rFonts w:ascii="Times New Roman" w:eastAsia="Times New Roman" w:hAnsi="Times New Roman" w:cs="Times New Roman"/>
-          <w:color w:val="0F1115"/>
-          <w:kern w:val="0"/>
-          <w14:ligatures w14:val="none"/>
-        </w:rPr>
-        <w:t xml:space="preserve"> (Project Manager):</w:t>
+        <w:t>Alex Hildreth (Project Manager)</w:t>
+      </w:r>
+      <w:r>
+        <w:rPr>
+          <w:rFonts w:ascii="Times New Roman" w:eastAsia="Times New Roman" w:hAnsi="Times New Roman" w:cs="Times New Roman"/>
+          <w:color w:val="0F1115"/>
+          <w:kern w:val="0"/>
+          <w14:ligatures w14:val="none"/>
+        </w:rPr>
+        <w:t>:</w:t>
       </w:r>
     </w:p>
     <w:p>
@@ -314,44 +332,88 @@
           <w:ilvl w:val="0"/>
           <w:numId w:val="4"/>
         </w:numPr>
-        <w:spacing w:after="120" w:line="480" w:lineRule="auto"/>
-        <w:jc w:val="both"/>
-        <w:rPr>
-          <w:rFonts w:ascii="Times New Roman" w:eastAsia="Times New Roman" w:hAnsi="Times New Roman" w:cs="Times New Roman"/>
-          <w:color w:val="0F1115"/>
-          <w:kern w:val="0"/>
-          <w14:ligatures w14:val="none"/>
-        </w:rPr>
-      </w:pPr>
+        <w:rPr>
+          <w:rFonts w:ascii="Times New Roman" w:eastAsia="Times New Roman" w:hAnsi="Times New Roman" w:cs="Times New Roman"/>
+          <w:color w:val="24292E"/>
+          <w:kern w:val="0"/>
+          <w14:ligatures w14:val="none"/>
+        </w:rPr>
+      </w:pPr>
+      <w:r>
+        <w:rPr>
+          <w:rFonts w:ascii="Times New Roman" w:eastAsia="Times New Roman" w:hAnsi="Times New Roman" w:cs="Times New Roman"/>
+          <w:color w:val="24292E"/>
+          <w:kern w:val="0"/>
+          <w14:ligatures w14:val="none"/>
+        </w:rPr>
+        <w:t>Added check box to transactions</w:t>
+      </w:r>
+      <w:r>
+        <w:rPr>
+          <w:rFonts w:ascii="Times New Roman" w:eastAsia="Times New Roman" w:hAnsi="Times New Roman" w:cs="Times New Roman"/>
+          <w:color w:val="24292E"/>
+          <w:kern w:val="0"/>
+          <w14:ligatures w14:val="none"/>
+        </w:rPr>
+        <w:t xml:space="preserve"> (removed</w:t>
+      </w:r>
+      <w:r>
+        <w:rPr>
+          <w:rFonts w:ascii="Times New Roman" w:eastAsia="Times New Roman" w:hAnsi="Times New Roman" w:cs="Times New Roman"/>
+          <w:color w:val="24292E"/>
+          <w:kern w:val="0"/>
+          <w14:ligatures w14:val="none"/>
+        </w:rPr>
+        <w:t xml:space="preserve"> later), and tried to fix </w:t>
+      </w:r>
+      <w:r>
+        <w:rPr>
+          <w:rFonts w:ascii="Times New Roman" w:eastAsia="Times New Roman" w:hAnsi="Times New Roman" w:cs="Times New Roman"/>
+          <w:color w:val="24292E"/>
+          <w:kern w:val="0"/>
+          <w14:ligatures w14:val="none"/>
+        </w:rPr>
+        <w:t>CSS</w:t>
+      </w:r>
+      <w:r>
+        <w:rPr>
+          <w:rFonts w:ascii="Times New Roman" w:eastAsia="Times New Roman" w:hAnsi="Times New Roman" w:cs="Times New Roman"/>
+          <w:color w:val="24292E"/>
+          <w:kern w:val="0"/>
+          <w14:ligatures w14:val="none"/>
+        </w:rPr>
+        <w:t xml:space="preserve"> code for delete/u</w:t>
+      </w:r>
+      <w:r>
+        <w:rPr>
+          <w:rFonts w:ascii="Times New Roman" w:eastAsia="Times New Roman" w:hAnsi="Times New Roman" w:cs="Times New Roman"/>
+          <w:color w:val="24292E"/>
+          <w:kern w:val="0"/>
+          <w14:ligatures w14:val="none"/>
+        </w:rPr>
+        <w:t>pdate buttons</w:t>
+      </w:r>
+      <w:r>
+        <w:rPr>
+          <w:rFonts w:ascii="Times New Roman" w:eastAsia="Times New Roman" w:hAnsi="Times New Roman" w:cs="Times New Roman"/>
+          <w:color w:val="24292E"/>
+          <w:kern w:val="0"/>
+          <w14:ligatures w14:val="none"/>
+        </w:rPr>
+        <w:t>.</w:t>
+      </w:r>
     </w:p>
     <w:p>
       <w:pPr>
-        <w:numPr>
-          <w:ilvl w:val="0"/>
-          <w:numId w:val="1"/>
-        </w:numPr>
-        <w:spacing w:after="120" w:line="480" w:lineRule="auto"/>
-        <w:jc w:val="both"/>
-        <w:rPr>
-          <w:rFonts w:ascii="Times New Roman" w:eastAsia="Times New Roman" w:hAnsi="Times New Roman" w:cs="Times New Roman"/>
-          <w:b/>
-          <w:bCs/>
-          <w:color w:val="0F1115"/>
-          <w:kern w:val="0"/>
-          <w14:ligatures w14:val="none"/>
-        </w:rPr>
-      </w:pPr>
-      <w:r>
-        <w:rPr>
-          <w:rFonts w:ascii="Times New Roman" w:eastAsia="Times New Roman" w:hAnsi="Times New Roman" w:cs="Times New Roman"/>
-          <w:b/>
-          <w:bCs/>
-          <w:color w:val="0F1115"/>
-          <w:kern w:val="0"/>
-          <w14:ligatures w14:val="none"/>
-        </w:rPr>
-        <w:t>Daniel Austin:</w:t>
-      </w:r>
+        <w:pStyle w:val="ListParagraph"/>
+        <w:ind w:left="1080"/>
+        <w:rPr>
+          <w:rFonts w:ascii="Times New Roman" w:eastAsia="Times New Roman" w:hAnsi="Times New Roman" w:cs="Times New Roman"/>
+          <w:color w:val="24292E"/>
+          <w:kern w:val="0"/>
+          <w14:ligatures w14:val="none"/>
+        </w:rPr>
+      </w:pPr>
     </w:p>
     <w:p>
       <w:pPr>
@@ -364,22 +426,352 @@
         <w:jc w:val="both"/>
         <w:rPr>
           <w:rFonts w:ascii="Times New Roman" w:eastAsia="Times New Roman" w:hAnsi="Times New Roman" w:cs="Times New Roman"/>
+          <w:color w:val="0F1115"/>
+          <w:kern w:val="0"/>
+          <w14:ligatures w14:val="none"/>
+        </w:rPr>
+      </w:pPr>
+      <w:r>
+        <w:rPr>
+          <w:rFonts w:ascii="Times New Roman" w:eastAsia="Times New Roman" w:hAnsi="Times New Roman" w:cs="Times New Roman"/>
+          <w:color w:val="0F1115"/>
+          <w:kern w:val="0"/>
+          <w14:ligatures w14:val="none"/>
+        </w:rPr>
+        <w:t>Created filter by categories and dates.</w:t>
+      </w:r>
+    </w:p>
+    <w:p>
+      <w:pPr>
+        <w:pStyle w:val="ListParagraph"/>
+        <w:numPr>
+          <w:ilvl w:val="0"/>
+          <w:numId w:val="4"/>
+        </w:numPr>
+        <w:shd w:val="clear" w:color="auto" w:fill="FFFFFF"/>
+        <w:suppressAutoHyphens w:val="0"/>
+        <w:spacing w:after="120" w:line="480" w:lineRule="auto"/>
+        <w:jc w:val="both"/>
+        <w:rPr>
+          <w:rFonts w:ascii="Times New Roman" w:eastAsia="Times New Roman" w:hAnsi="Times New Roman" w:cs="Times New Roman"/>
+          <w:color w:val="0F1115"/>
+          <w:kern w:val="0"/>
+          <w14:ligatures w14:val="none"/>
+        </w:rPr>
+      </w:pPr>
+      <w:r>
+        <w:rPr>
+          <w:rFonts w:ascii="Times New Roman" w:eastAsia="Times New Roman" w:hAnsi="Times New Roman" w:cs="Times New Roman"/>
+          <w:color w:val="24292E"/>
+          <w:kern w:val="0"/>
+          <w14:ligatures w14:val="none"/>
+        </w:rPr>
+        <w:t>S</w:t>
+      </w:r>
+      <w:r>
+        <w:rPr>
+          <w:rFonts w:ascii="Times New Roman" w:eastAsia="Times New Roman" w:hAnsi="Times New Roman" w:cs="Times New Roman"/>
+          <w:color w:val="24292E"/>
+          <w:kern w:val="0"/>
+          <w14:ligatures w14:val="none"/>
+        </w:rPr>
+        <w:t>plitting</w:t>
+      </w:r>
+      <w:r>
+        <w:rPr>
+          <w:rFonts w:ascii="Times New Roman" w:eastAsia="Times New Roman" w:hAnsi="Times New Roman" w:cs="Times New Roman"/>
+          <w:color w:val="24292E"/>
+          <w:kern w:val="0"/>
+          <w14:ligatures w14:val="none"/>
+        </w:rPr>
+        <w:t xml:space="preserve"> </w:t>
+      </w:r>
+      <w:r>
+        <w:rPr>
+          <w:rFonts w:ascii="Times New Roman" w:eastAsia="Times New Roman" w:hAnsi="Times New Roman" w:cs="Times New Roman"/>
+          <w:color w:val="24292E"/>
+          <w:kern w:val="0"/>
+          <w14:ligatures w14:val="none"/>
+        </w:rPr>
+        <w:t>the list of transactions into multiple pages with previous and</w:t>
+      </w:r>
+      <w:r>
+        <w:rPr>
+          <w:rFonts w:ascii="Times New Roman" w:eastAsia="Times New Roman" w:hAnsi="Times New Roman" w:cs="Times New Roman"/>
+          <w:color w:val="24292E"/>
+          <w:kern w:val="0"/>
+          <w14:ligatures w14:val="none"/>
+        </w:rPr>
+        <w:t xml:space="preserve"> next buttons.</w:t>
+      </w:r>
+    </w:p>
+    <w:p>
+      <w:pPr>
+        <w:pStyle w:val="ListParagraph"/>
+        <w:numPr>
+          <w:ilvl w:val="0"/>
+          <w:numId w:val="4"/>
+        </w:numPr>
+        <w:shd w:val="clear" w:color="auto" w:fill="FFFFFF"/>
+        <w:suppressAutoHyphens w:val="0"/>
+        <w:spacing w:after="0" w:line="480" w:lineRule="auto"/>
+        <w:rPr>
+          <w:rFonts w:ascii="Times New Roman" w:eastAsia="Times New Roman" w:hAnsi="Times New Roman" w:cs="Times New Roman"/>
+          <w:color w:val="24292E"/>
+          <w:kern w:val="0"/>
+          <w14:ligatures w14:val="none"/>
+        </w:rPr>
+      </w:pPr>
+      <w:r>
+        <w:rPr>
+          <w:rFonts w:ascii="Times New Roman" w:eastAsia="Times New Roman" w:hAnsi="Times New Roman" w:cs="Times New Roman"/>
+          <w:color w:val="24292E"/>
+          <w:kern w:val="0"/>
+          <w14:ligatures w14:val="none"/>
+        </w:rPr>
+        <w:t>Fixed Edit modal by placing Date label and date picker on the same line</w:t>
+      </w:r>
+      <w:r>
+        <w:rPr>
+          <w:rFonts w:ascii="Times New Roman" w:eastAsia="Times New Roman" w:hAnsi="Times New Roman" w:cs="Times New Roman"/>
+          <w:color w:val="24292E"/>
+          <w:kern w:val="0"/>
+          <w14:ligatures w14:val="none"/>
+        </w:rPr>
+        <w:t xml:space="preserve"> for better design.</w:t>
+      </w:r>
+    </w:p>
+    <w:p>
+      <w:pPr>
+        <w:pStyle w:val="ListParagraph"/>
+        <w:numPr>
+          <w:ilvl w:val="0"/>
+          <w:numId w:val="4"/>
+        </w:numPr>
+        <w:suppressAutoHyphens w:val="0"/>
+        <w:spacing w:after="0" w:line="480" w:lineRule="auto"/>
+        <w:rPr>
+          <w:rFonts w:ascii="Times New Roman" w:eastAsia="Times New Roman" w:hAnsi="Times New Roman" w:cs="Times New Roman"/>
+          <w:kern w:val="0"/>
+          <w14:ligatures w14:val="none"/>
+        </w:rPr>
+      </w:pPr>
+      <w:r>
+        <w:rPr>
+          <w:rFonts w:ascii="Times New Roman" w:eastAsia="Times New Roman" w:hAnsi="Times New Roman" w:cs="Times New Roman"/>
+          <w:kern w:val="0"/>
+          <w14:ligatures w14:val="none"/>
+        </w:rPr>
+        <w:t>Fixed balance calculation in pagination to show total across all pages.</w:t>
+      </w:r>
+    </w:p>
+    <w:p>
+      <w:pPr>
+        <w:pStyle w:val="ListParagraph"/>
+        <w:numPr>
+          <w:ilvl w:val="0"/>
+          <w:numId w:val="4"/>
+        </w:numPr>
+        <w:shd w:val="clear" w:color="auto" w:fill="FFFFFF"/>
+        <w:suppressAutoHyphens w:val="0"/>
+        <w:spacing w:after="0" w:line="480" w:lineRule="auto"/>
+        <w:rPr>
+          <w:rFonts w:ascii="Times New Roman" w:eastAsia="Times New Roman" w:hAnsi="Times New Roman" w:cs="Times New Roman"/>
+          <w:color w:val="24292E"/>
+          <w:kern w:val="0"/>
+          <w14:ligatures w14:val="none"/>
+        </w:rPr>
+      </w:pPr>
+      <w:r>
+        <w:rPr>
+          <w:rFonts w:ascii="Times New Roman" w:eastAsia="Times New Roman" w:hAnsi="Times New Roman" w:cs="Times New Roman"/>
+          <w:color w:val="24292E"/>
+          <w:kern w:val="0"/>
+          <w14:ligatures w14:val="none"/>
+        </w:rPr>
+        <w:t>F</w:t>
+      </w:r>
+      <w:r>
+        <w:rPr>
+          <w:rFonts w:ascii="Times New Roman" w:eastAsia="Times New Roman" w:hAnsi="Times New Roman" w:cs="Times New Roman"/>
+          <w:color w:val="24292E"/>
+          <w:kern w:val="0"/>
+          <w14:ligatures w14:val="none"/>
+        </w:rPr>
+        <w:t>ix</w:t>
+      </w:r>
+      <w:r>
+        <w:rPr>
+          <w:rFonts w:ascii="Times New Roman" w:eastAsia="Times New Roman" w:hAnsi="Times New Roman" w:cs="Times New Roman"/>
+          <w:color w:val="24292E"/>
+          <w:kern w:val="0"/>
+          <w14:ligatures w14:val="none"/>
+        </w:rPr>
+        <w:t>ed</w:t>
+      </w:r>
+      <w:r>
+        <w:rPr>
+          <w:rFonts w:ascii="Times New Roman" w:eastAsia="Times New Roman" w:hAnsi="Times New Roman" w:cs="Times New Roman"/>
+          <w:color w:val="24292E"/>
+          <w:kern w:val="0"/>
+          <w14:ligatures w14:val="none"/>
+        </w:rPr>
+        <w:t xml:space="preserve"> balance to show tot</w:t>
+      </w:r>
+      <w:r>
+        <w:rPr>
+          <w:rFonts w:ascii="Times New Roman" w:eastAsia="Times New Roman" w:hAnsi="Times New Roman" w:cs="Times New Roman"/>
+          <w:color w:val="24292E"/>
+          <w:kern w:val="0"/>
+          <w14:ligatures w14:val="none"/>
+        </w:rPr>
+        <w:t>al balance even when filters return no results</w:t>
+      </w:r>
+      <w:r>
+        <w:rPr>
+          <w:rFonts w:ascii="Times New Roman" w:eastAsia="Times New Roman" w:hAnsi="Times New Roman" w:cs="Times New Roman"/>
+          <w:color w:val="24292E"/>
+          <w:kern w:val="0"/>
+          <w14:ligatures w14:val="none"/>
+        </w:rPr>
+        <w:t>.</w:t>
+      </w:r>
+    </w:p>
+    <w:p>
+      <w:pPr>
+        <w:pStyle w:val="ListParagraph"/>
+        <w:numPr>
+          <w:ilvl w:val="0"/>
+          <w:numId w:val="4"/>
+        </w:numPr>
+        <w:suppressAutoHyphens w:val="0"/>
+        <w:spacing w:after="0" w:line="480" w:lineRule="auto"/>
+        <w:rPr>
+          <w:rFonts w:ascii="Times New Roman" w:eastAsia="Times New Roman" w:hAnsi="Times New Roman" w:cs="Times New Roman"/>
+          <w:kern w:val="0"/>
+          <w14:ligatures w14:val="none"/>
+        </w:rPr>
+      </w:pPr>
+      <w:r>
+        <w:rPr>
+          <w:rFonts w:ascii="Times New Roman" w:eastAsia="Times New Roman" w:hAnsi="Times New Roman" w:cs="Times New Roman"/>
+          <w:kern w:val="0"/>
+          <w14:ligatures w14:val="none"/>
+        </w:rPr>
+        <w:lastRenderedPageBreak/>
+        <w:t>Added Expanded Veryfi Category Mapping for Receipt Processing</w:t>
+      </w:r>
+      <w:r>
+        <w:rPr>
+          <w:rFonts w:ascii="Times New Roman" w:eastAsia="Times New Roman" w:hAnsi="Times New Roman" w:cs="Times New Roman"/>
+          <w:kern w:val="0"/>
+          <w14:ligatures w14:val="none"/>
+        </w:rPr>
+        <w:t>.</w:t>
+      </w:r>
+    </w:p>
+    <w:p>
+      <w:pPr>
+        <w:pStyle w:val="ListParagraph"/>
+        <w:numPr>
+          <w:ilvl w:val="0"/>
+          <w:numId w:val="4"/>
+        </w:numPr>
+        <w:suppressAutoHyphens w:val="0"/>
+        <w:spacing w:after="0" w:line="480" w:lineRule="auto"/>
+        <w:rPr>
+          <w:rFonts w:ascii="Times New Roman" w:eastAsia="Times New Roman" w:hAnsi="Times New Roman" w:cs="Times New Roman"/>
+          <w:kern w:val="0"/>
+          <w14:ligatures w14:val="none"/>
+        </w:rPr>
+      </w:pPr>
+      <w:r>
+        <w:rPr>
+          <w:rFonts w:ascii="Times New Roman" w:eastAsia="Times New Roman" w:hAnsi="Times New Roman" w:cs="Times New Roman"/>
+          <w:kern w:val="0"/>
+          <w14:ligatures w14:val="none"/>
+        </w:rPr>
+        <w:t>Improved Add Transaction Modal Layout</w:t>
+      </w:r>
+      <w:r>
+        <w:rPr>
+          <w:rFonts w:ascii="Times New Roman" w:eastAsia="Times New Roman" w:hAnsi="Times New Roman" w:cs="Times New Roman"/>
+          <w:kern w:val="0"/>
+          <w14:ligatures w14:val="none"/>
+        </w:rPr>
+        <w:t>.</w:t>
+      </w:r>
+    </w:p>
+    <w:p>
+      <w:pPr>
+        <w:suppressAutoHyphens w:val="0"/>
+        <w:spacing w:after="0" w:line="480" w:lineRule="auto"/>
+        <w:rPr>
+          <w:rFonts w:ascii="Times New Roman" w:eastAsia="Times New Roman" w:hAnsi="Times New Roman" w:cs="Times New Roman"/>
+          <w:kern w:val="0"/>
+          <w14:ligatures w14:val="none"/>
+        </w:rPr>
+      </w:pPr>
+    </w:p>
+    <w:p>
+      <w:pPr>
+        <w:numPr>
+          <w:ilvl w:val="0"/>
+          <w:numId w:val="1"/>
+        </w:numPr>
+        <w:spacing w:after="120" w:line="480" w:lineRule="auto"/>
+        <w:jc w:val="both"/>
+        <w:rPr>
+          <w:rFonts w:ascii="Times New Roman" w:eastAsia="Times New Roman" w:hAnsi="Times New Roman" w:cs="Times New Roman"/>
+          <w:color w:val="0F1115"/>
+          <w:kern w:val="0"/>
+          <w14:ligatures w14:val="none"/>
+        </w:rPr>
+      </w:pPr>
+      <w:r>
+        <w:rPr>
+          <w:rFonts w:ascii="Times New Roman" w:eastAsia="Times New Roman" w:hAnsi="Times New Roman" w:cs="Times New Roman"/>
           <w:b/>
           <w:bCs/>
           <w:color w:val="0F1115"/>
           <w:kern w:val="0"/>
           <w14:ligatures w14:val="none"/>
         </w:rPr>
-      </w:pPr>
+        <w:t>Daniel Austin</w:t>
+      </w:r>
+      <w:r>
+        <w:rPr>
+          <w:rFonts w:ascii="Times New Roman" w:eastAsia="Times New Roman" w:hAnsi="Times New Roman" w:cs="Times New Roman"/>
+          <w:color w:val="0F1115"/>
+          <w:kern w:val="0"/>
+          <w14:ligatures w14:val="none"/>
+        </w:rPr>
+        <w:t>:</w:t>
+      </w:r>
     </w:p>
     <w:p>
       <w:pPr>
+        <w:pStyle w:val="ListParagraph"/>
+        <w:numPr>
+          <w:ilvl w:val="0"/>
+          <w:numId w:val="4"/>
+        </w:numPr>
         <w:spacing w:after="120" w:line="480" w:lineRule="auto"/>
         <w:jc w:val="both"/>
         <w:rPr>
           <w:rFonts w:ascii="Times New Roman" w:eastAsia="Times New Roman" w:hAnsi="Times New Roman" w:cs="Times New Roman"/>
-          <w:b/>
-          <w:bCs/>
+          <w:color w:val="0F1115"/>
+          <w:kern w:val="0"/>
+          <w14:ligatures w14:val="none"/>
+        </w:rPr>
+      </w:pPr>
+    </w:p>
+    <w:p>
+      <w:pPr>
+        <w:spacing w:after="120" w:line="480" w:lineRule="auto"/>
+        <w:jc w:val="both"/>
+        <w:rPr>
+          <w:rFonts w:ascii="Times New Roman" w:eastAsia="Times New Roman" w:hAnsi="Times New Roman" w:cs="Times New Roman"/>
           <w:color w:val="0F1115"/>
           <w:kern w:val="0"/>
           <w14:ligatures w14:val="none"/>
@@ -397,7 +789,7 @@
     </w:p>
     <w:sectPr>
       <w:pgSz w:w="12240" w:h="15840"/>
-      <w:pgMar w:top="450" w:right="900" w:bottom="1440" w:left="990" w:header="0" w:footer="0" w:gutter="0"/>
+      <w:pgMar w:top="1170" w:right="900" w:bottom="1440" w:left="990" w:header="0" w:footer="0" w:gutter="0"/>
       <w:cols w:space="720"/>
       <w:formProt w:val="0"/>
       <w:docGrid w:linePitch="360"/>

</xml_diff>